<commit_message>
vault backup: 2026-08-26 22:57:08
</commit_message>
<xml_diff>
--- a/CS/JAVA/OS_Java_01_Kernel_Process_Thread.docx
+++ b/CS/JAVA/OS_Java_01_Kernel_Process_Thread.docx
@@ -1019,6 +1019,21 @@
     </w:p>
     <w:p>
       <w:pPr>
+        <w:spacing w:after="120" w:line="276" w:lineRule="auto"/>
+      </w:pPr>
+      <w:r>
+        <w:rPr>
+          <w:rFonts w:ascii="Malgun Gothic" w:hAnsi="Malgun Gothic" w:eastAsia="Malgun Gothic" w:cs="Malgun Gothic"/>
+          <w:b w:val="0"/>
+          <w:i w:val="0"/>
+          <w:color w:val="666666"/>
+          <w:sz w:val="16"/>
+        </w:rPr>
+        <w:t>답안  __________________________________________________________________________</w:t>
+      </w:r>
+    </w:p>
+    <w:p>
+      <w:pPr>
         <w:spacing w:after="80" w:line="276" w:lineRule="auto"/>
       </w:pPr>
       <w:r>
@@ -1044,6 +1059,21 @@
           <w:sz w:val="18"/>
         </w:rPr>
         <w:t>진단 2. 프로세스의 모든 스레드가 공유하는 것과 공유하지 않는 것을 각각 하나 쓰라.</w:t>
+      </w:r>
+    </w:p>
+    <w:p>
+      <w:pPr>
+        <w:spacing w:after="120" w:line="276" w:lineRule="auto"/>
+      </w:pPr>
+      <w:r>
+        <w:rPr>
+          <w:rFonts w:ascii="Malgun Gothic" w:hAnsi="Malgun Gothic" w:eastAsia="Malgun Gothic" w:cs="Malgun Gothic"/>
+          <w:b w:val="0"/>
+          <w:i w:val="0"/>
+          <w:color w:val="666666"/>
+          <w:sz w:val="16"/>
+        </w:rPr>
+        <w:t>답안  __________________________________________________________________________</w:t>
       </w:r>
     </w:p>
     <w:p>
@@ -1107,6 +1137,21 @@
     </w:p>
     <w:p>
       <w:pPr>
+        <w:spacing w:after="120" w:line="276" w:lineRule="auto"/>
+      </w:pPr>
+      <w:r>
+        <w:rPr>
+          <w:rFonts w:ascii="Malgun Gothic" w:hAnsi="Malgun Gothic" w:eastAsia="Malgun Gothic" w:cs="Malgun Gothic"/>
+          <w:b w:val="0"/>
+          <w:i w:val="0"/>
+          <w:color w:val="666666"/>
+          <w:sz w:val="16"/>
+        </w:rPr>
+        <w:t>답안  __________________________________________________________________________</w:t>
+      </w:r>
+    </w:p>
+    <w:p>
+      <w:pPr>
         <w:spacing w:after="80" w:line="276" w:lineRule="auto"/>
       </w:pPr>
       <w:r>
@@ -1132,6 +1177,21 @@
           <w:sz w:val="18"/>
         </w:rPr>
         <w:t>진단 4. 스레드 10,000개가 CPU를 거의 쓰지 않아도 위험할 수 있는 이유는?</w:t>
+      </w:r>
+    </w:p>
+    <w:p>
+      <w:pPr>
+        <w:spacing w:after="120" w:line="276" w:lineRule="auto"/>
+      </w:pPr>
+      <w:r>
+        <w:rPr>
+          <w:rFonts w:ascii="Malgun Gothic" w:hAnsi="Malgun Gothic" w:eastAsia="Malgun Gothic" w:cs="Malgun Gothic"/>
+          <w:b w:val="0"/>
+          <w:i w:val="0"/>
+          <w:color w:val="666666"/>
+          <w:sz w:val="16"/>
+        </w:rPr>
+        <w:t>답안  __________________________________________________________________________</w:t>
       </w:r>
     </w:p>
     <w:p>
@@ -5533,6 +5593,141 @@
                 <w:sz w:val="14"/>
               </w:rPr>
               <w:t>();</w:t>
+            </w:r>
+            <w:r>
+              <w:br/>
+            </w:r>
+            <w:r>
+              <w:rPr>
+                <w:rFonts w:ascii="Cascadia Mono" w:hAnsi="Cascadia Mono" w:eastAsia="Cascadia Mono" w:cs="Cascadia Mono"/>
+                <w:color w:val="444444"/>
+                <w:sz w:val="14"/>
+              </w:rPr>
+              <w:t xml:space="preserve">        </w:t>
+            </w:r>
+            <w:r>
+              <w:rPr>
+                <w:rFonts w:ascii="Cascadia Mono" w:hAnsi="Cascadia Mono" w:eastAsia="Cascadia Mono" w:cs="Cascadia Mono"/>
+                <w:b w:val="0"/>
+                <w:color w:val="555555"/>
+                <w:sz w:val="14"/>
+              </w:rPr>
+              <w:t>System</w:t>
+            </w:r>
+            <w:r>
+              <w:rPr>
+                <w:rFonts w:ascii="Cascadia Mono" w:hAnsi="Cascadia Mono" w:eastAsia="Cascadia Mono" w:cs="Cascadia Mono"/>
+                <w:color w:val="444444"/>
+                <w:sz w:val="14"/>
+              </w:rPr>
+              <w:t>.</w:t>
+            </w:r>
+            <w:r>
+              <w:rPr>
+                <w:rFonts w:ascii="Cascadia Mono" w:hAnsi="Cascadia Mono" w:eastAsia="Cascadia Mono" w:cs="Cascadia Mono"/>
+                <w:b w:val="0"/>
+                <w:color w:val="555555"/>
+                <w:sz w:val="14"/>
+              </w:rPr>
+              <w:t>out</w:t>
+            </w:r>
+            <w:r>
+              <w:rPr>
+                <w:rFonts w:ascii="Cascadia Mono" w:hAnsi="Cascadia Mono" w:eastAsia="Cascadia Mono" w:cs="Cascadia Mono"/>
+                <w:color w:val="444444"/>
+                <w:sz w:val="14"/>
+              </w:rPr>
+              <w:t>.</w:t>
+            </w:r>
+            <w:r>
+              <w:rPr>
+                <w:rFonts w:ascii="Cascadia Mono" w:hAnsi="Cascadia Mono" w:eastAsia="Cascadia Mono" w:cs="Cascadia Mono"/>
+                <w:b w:val="0"/>
+                <w:color w:val="555555"/>
+                <w:sz w:val="14"/>
+              </w:rPr>
+              <w:t>println</w:t>
+            </w:r>
+            <w:r>
+              <w:rPr>
+                <w:rFonts w:ascii="Cascadia Mono" w:hAnsi="Cascadia Mono" w:eastAsia="Cascadia Mono" w:cs="Cascadia Mono"/>
+                <w:color w:val="444444"/>
+                <w:sz w:val="14"/>
+              </w:rPr>
+              <w:t>(</w:t>
+            </w:r>
+            <w:r>
+              <w:rPr>
+                <w:rFonts w:ascii="Cascadia Mono" w:hAnsi="Cascadia Mono" w:eastAsia="Cascadia Mono" w:cs="Cascadia Mono"/>
+                <w:b w:val="0"/>
+                <w:color w:val="555555"/>
+                <w:sz w:val="14"/>
+              </w:rPr>
+              <w:t>"after="</w:t>
+            </w:r>
+            <w:r>
+              <w:rPr>
+                <w:rFonts w:ascii="Cascadia Mono" w:hAnsi="Cascadia Mono" w:eastAsia="Cascadia Mono" w:cs="Cascadia Mono"/>
+                <w:color w:val="444444"/>
+                <w:sz w:val="14"/>
+              </w:rPr>
+              <w:t xml:space="preserve"> + </w:t>
+            </w:r>
+            <w:r>
+              <w:rPr>
+                <w:rFonts w:ascii="Cascadia Mono" w:hAnsi="Cascadia Mono" w:eastAsia="Cascadia Mono" w:cs="Cascadia Mono"/>
+                <w:b w:val="0"/>
+                <w:color w:val="555555"/>
+                <w:sz w:val="14"/>
+              </w:rPr>
+              <w:t>worker</w:t>
+            </w:r>
+            <w:r>
+              <w:rPr>
+                <w:rFonts w:ascii="Cascadia Mono" w:hAnsi="Cascadia Mono" w:eastAsia="Cascadia Mono" w:cs="Cascadia Mono"/>
+                <w:color w:val="444444"/>
+                <w:sz w:val="14"/>
+              </w:rPr>
+              <w:t>.</w:t>
+            </w:r>
+            <w:r>
+              <w:rPr>
+                <w:rFonts w:ascii="Cascadia Mono" w:hAnsi="Cascadia Mono" w:eastAsia="Cascadia Mono" w:cs="Cascadia Mono"/>
+                <w:b w:val="0"/>
+                <w:color w:val="555555"/>
+                <w:sz w:val="14"/>
+              </w:rPr>
+              <w:t>getState</w:t>
+            </w:r>
+            <w:r>
+              <w:rPr>
+                <w:rFonts w:ascii="Cascadia Mono" w:hAnsi="Cascadia Mono" w:eastAsia="Cascadia Mono" w:cs="Cascadia Mono"/>
+                <w:color w:val="444444"/>
+                <w:sz w:val="14"/>
+              </w:rPr>
+              <w:t>());</w:t>
+            </w:r>
+            <w:r>
+              <w:br/>
+            </w:r>
+            <w:r>
+              <w:rPr>
+                <w:rFonts w:ascii="Cascadia Mono" w:hAnsi="Cascadia Mono" w:eastAsia="Cascadia Mono" w:cs="Cascadia Mono"/>
+                <w:color w:val="444444"/>
+                <w:sz w:val="14"/>
+              </w:rPr>
+              <w:t xml:space="preserve">    }</w:t>
+            </w:r>
+            <w:r>
+              <w:br/>
+            </w:r>
+            <w:r>
+              <w:rPr>
+                <w:rFonts w:ascii="Cascadia Mono" w:hAnsi="Cascadia Mono" w:eastAsia="Cascadia Mono" w:cs="Cascadia Mono"/>
+                <w:color w:val="444444"/>
+                <w:sz w:val="14"/>
+              </w:rPr>
+              <w:t>}</w:t>
             </w:r>
           </w:p>
         </w:tc>
@@ -11011,7 +11206,7 @@
                 <w:color w:val="555555"/>
                 <w:sz w:val="14"/>
               </w:rPr>
-              <w:t>// 검사 이벤트 처리: 느린 장비는 이 플랫폼 스레드를 계속 점유한다.</w:t>
+              <w:t>// A slow device keeps this platform thread occupied.</w:t>
             </w:r>
             <w:r>
               <w:br/>
@@ -11104,7 +11299,7 @@
                 <w:color w:val="555555"/>
                 <w:sz w:val="14"/>
               </w:rPr>
-              <w:t>// 예제 단순화를 위해 로깅은 생략한다.</w:t>
+              <w:t>// Logging is omitted to keep the example minimal.</w:t>
             </w:r>
             <w:r>
               <w:br/>
@@ -16325,7 +16520,7 @@
                 <w:color w:val="555555"/>
                 <w:sz w:val="14"/>
               </w:rPr>
-              <w:t>// 포화 시 연결을 명시적으로 닫아 누수를 막는다.</w:t>
+              <w:t>// Close explicitly on saturation.</w:t>
             </w:r>
             <w:r>
               <w:br/>
@@ -16776,7 +16971,7 @@
                 <w:color w:val="555555"/>
                 <w:sz w:val="14"/>
               </w:rPr>
-              <w:t>// Step 5에서 framing과 timeout을 보강한다.</w:t>
+              <w:t>// Step 5 adds framing and timeouts.</w:t>
             </w:r>
             <w:r>
               <w:br/>

</xml_diff>